<commit_message>
Finish Social Software Fuser ending
</commit_message>
<xml_diff>
--- a/marketing/sosoft-reel/receipt/revision-03/scores-for-social-software-r03-receipt.docx
+++ b/marketing/sosoft-reel/receipt/revision-03/scores-for-social-software-r03-receipt.docx
@@ -24,7 +24,7 @@
         <w:rPr>
           <w:color w:val="5A5A5A"/>
         </w:rPr>
-        <w:t>Review cut · 02:57 · 1080 × 1920 vertical · prepared 27 July 2026</w:t>
+        <w:t>Review cut · 02:55 · 1080 × 1920 vertical · prepared 27 July 2026</w:t>
       </w:r>
     </w:p>
     <w:p>
@@ -94,6 +94,17 @@
         <w:rPr>
           <w:b/>
         </w:rPr>
+        <w:t xml:space="preserve">Casey’s copy feedback. </w:t>
+      </w:r>
+      <w:r>
+        <w:t>Corrected the Æther packet description, replaced the limiting ‘same question’ conclusion, and incorporated the accepted Google Doc copy edits into the published article and screenplay.</w:t>
+      </w:r>
+    </w:p>
+    <w:p>
+      <w:r>
+        <w:rPr>
+          <w:b/>
+        </w:rPr>
         <w:t xml:space="preserve">Narration. </w:t>
       </w:r>
       <w:r>
@@ -119,7 +130,7 @@
         <w:t xml:space="preserve">Picture. </w:t>
       </w:r>
       <w:r>
-        <w:t>Reframed Chelly Jin, rotated and filled Thomas Noya, centered Banyi Huang, lifted bottom-heavy crops, and sharpened the image with stronger black points.</w:t>
+        <w:t>Reframed Chelly Jin, rotated and filled Thomas Noya, centered Banyi Huang, lifted bottom-heavy crops, sharpened the image, and added Casey’s June 13 Fuser documentation to the closing.</w:t>
       </w:r>
     </w:p>
     <w:p>
@@ -141,7 +152,7 @@
         <w:t xml:space="preserve">Sound and delivery. </w:t>
       </w:r>
       <w:r>
-        <w:t>Retimed the full picture spine to 02:57, expanded the music, balanced the guide voice, and exported a color-tagged BT.709 review cut.</w:t>
+        <w:t>Retimed the full picture spine to 02:55, expanded the music, balanced the guide voice, and exported a color-tagged BT.709 review cut.</w:t>
       </w:r>
     </w:p>
     <w:p>
@@ -250,7 +261,7 @@
         <w:jc w:val="left"/>
       </w:pPr>
       <w:r>
-        <w:t>SSF-01 · 00:22–00:36</w:t>
+        <w:t>SSF-01 · 00:22–00:34</w:t>
       </w:r>
       <w:r>
         <w:br/>
@@ -307,7 +318,7 @@
         <w:t xml:space="preserve">Narration. </w:t>
       </w:r>
       <w:r>
-        <w:t>I’m Jeffrey Alan Scudder. My contribution is Notepat. A folded white user manual opens into a pointed shape, combining an illustrated player, a QR code, instructions, and circular keyboard diagrams.</w:t>
+        <w:t>I’m Jeffrey Alan Scudder. My contribution is Notepat, a folded white research paper that combines an illustrated player, a QR code, instructions, and circular keyboard diagrams.</w:t>
       </w:r>
     </w:p>
     <w:p>
@@ -331,7 +342,7 @@
         <w:jc w:val="left"/>
       </w:pPr>
       <w:r>
-        <w:t>SSF-02 · 00:36–00:45</w:t>
+        <w:t>SSF-02 · 00:34–00:42</w:t>
       </w:r>
       <w:r>
         <w:br/>
@@ -412,7 +423,7 @@
         <w:jc w:val="left"/>
       </w:pPr>
       <w:r>
-        <w:t>SSF-03 · 00:45–00:54</w:t>
+        <w:t>SSF-03 · 00:42–00:53</w:t>
       </w:r>
       <w:r>
         <w:br/>
@@ -493,7 +504,7 @@
         <w:jc w:val="left"/>
       </w:pPr>
       <w:r>
-        <w:t>SSF-04 · 00:54–01:10</w:t>
+        <w:t>SSF-04 · 00:53–01:10</w:t>
       </w:r>
       <w:r>
         <w:br/>
@@ -574,7 +585,7 @@
         <w:jc w:val="left"/>
       </w:pPr>
       <w:r>
-        <w:t>SSF-05 · 01:10–01:23</w:t>
+        <w:t>SSF-05 · 01:10–01:21</w:t>
       </w:r>
       <w:r>
         <w:br/>
@@ -655,7 +666,7 @@
         <w:jc w:val="left"/>
       </w:pPr>
       <w:r>
-        <w:t>SSF-06 · 01:23–01:34</w:t>
+        <w:t>SSF-06 · 01:21–01:32</w:t>
       </w:r>
       <w:r>
         <w:br/>
@@ -736,7 +747,7 @@
         <w:jc w:val="left"/>
       </w:pPr>
       <w:r>
-        <w:t>SSF-07 · 01:34–01:46</w:t>
+        <w:t>SSF-07 · 01:32–01:46</w:t>
       </w:r>
       <w:r>
         <w:br/>
@@ -898,7 +909,7 @@
         <w:jc w:val="left"/>
       </w:pPr>
       <w:r>
-        <w:t>SSF-09 · 01:58–02:12</w:t>
+        <w:t>SSF-09 · 01:58–02:09</w:t>
       </w:r>
       <w:r>
         <w:br/>
@@ -979,7 +990,7 @@
         <w:jc w:val="left"/>
       </w:pPr>
       <w:r>
-        <w:t>SSF-10 · 02:12–02:24</w:t>
+        <w:t>SSF-10 · 02:09–02:19</w:t>
       </w:r>
       <w:r>
         <w:br/>
@@ -1060,7 +1071,7 @@
         <w:jc w:val="left"/>
       </w:pPr>
       <w:r>
-        <w:t>SSF-11 · 02:24–02:57</w:t>
+        <w:t>SSF-11 · 02:19–02:55</w:t>
       </w:r>
       <w:r>
         <w:br/>

</xml_diff>

<commit_message>
Finish Social Software review package
</commit_message>
<xml_diff>
--- a/marketing/sosoft-reel/receipt/revision-03/scores-for-social-software-r03-receipt.docx
+++ b/marketing/sosoft-reel/receipt/revision-03/scores-for-social-software-r03-receipt.docx
@@ -24,7 +24,7 @@
         <w:rPr>
           <w:color w:val="5A5A5A"/>
         </w:rPr>
-        <w:t>Review cut · 02:55 · 1080 × 1920 vertical · prepared 27 July 2026</w:t>
+        <w:t>Review cut · 02:53 · 1080 × 1920 vertical · prepared 27 July 2026</w:t>
       </w:r>
     </w:p>
     <w:p>
@@ -53,12 +53,23 @@
             <w:color w:val="1155CC"/>
             <w:u w:val="single"/>
           </w:rPr>
+          <w:t>Comment on the Google Doc screenplay</w:t>
+        </w:r>
+      </w:hyperlink>
+    </w:p>
+    <w:p>
+      <w:hyperlink r:id="rId11">
+        <w:r>
+          <w:rPr>
+            <w:color w:val="1155CC"/>
+            <w:u w:val="single"/>
+          </w:rPr>
           <w:t>Open the final article source + Casey edit log</w:t>
         </w:r>
       </w:hyperlink>
     </w:p>
     <w:p>
-      <w:hyperlink r:id="rId11">
+      <w:hyperlink r:id="rId12">
         <w:r>
           <w:rPr>
             <w:color w:val="1155CC"/>
@@ -105,10 +116,10 @@
         <w:rPr>
           <w:b/>
         </w:rPr>
-        <w:t xml:space="preserve">Narration. </w:t>
+        <w:t xml:space="preserve">Content. </w:t>
       </w:r>
       <w:r>
-        <w:t>Added “64 hand-produced artist scores,” Jeffrey’s spoken introduction, the envelope invitation, two-edition context, and the Social Software Cohort 2 goodbye.</w:t>
+        <w:t>Added ‘64 hand-produced artist scores,’ ‘copy #51,’ the two-edition invitation, Jeffrey’s goodbye, and Casey’s June 13 Fuser photographs; widened Jordan Silver and kept Banyi Huang’s complete credit in one utterance.</w:t>
       </w:r>
     </w:p>
     <w:p>
@@ -116,32 +127,10 @@
         <w:rPr>
           <w:b/>
         </w:rPr>
-        <w:t xml:space="preserve">Identity. </w:t>
+        <w:t xml:space="preserve">Picture and identity. </w:t>
       </w:r>
       <w:r>
-        <w:t>Artists are pink, work titles are teal, names stay intact, and the SO/SOFT side stamps respond to each pink artist introduction.</w:t>
-      </w:r>
-    </w:p>
-    <w:p>
-      <w:r>
-        <w:rPr>
-          <w:b/>
-        </w:rPr>
-        <w:t xml:space="preserve">Picture. </w:t>
-      </w:r>
-      <w:r>
-        <w:t>Reframed Chelly Jin, rotated and filled Thomas Noya, centered Banyi Huang, lifted bottom-heavy crops, sharpened the image, and added Casey’s June 13 Fuser documentation to the closing.</w:t>
-      </w:r>
-    </w:p>
-    <w:p>
-      <w:r>
-        <w:rPr>
-          <w:b/>
-        </w:rPr>
-        <w:t xml:space="preserve">Captions. </w:t>
-      </w:r>
-      <w:r>
-        <w:t>Raised and reduced the subtitles, removed the backdrop strip, added a restrained dark shadow, and added a proportional blue chapter progress bar.</w:t>
+        <w:t>Reframed the moving images, sharpened the crop, raised the captions, added a blue chapter bar, animated credit letters individually, and softened the SO/SOFT response into a wobble.</w:t>
       </w:r>
     </w:p>
     <w:p>
@@ -152,7 +141,7 @@
         <w:t xml:space="preserve">Sound and delivery. </w:t>
       </w:r>
       <w:r>
-        <w:t>Retimed the full picture spine to 02:55, expanded the music, balanced the guide voice, and exported a color-tagged BT.709 review cut.</w:t>
+        <w:t>Retimed the full picture spine to 02:53, expanded the music, balanced the guide voice, and exported a color-tagged BT.709 review cut.</w:t>
       </w:r>
     </w:p>
     <w:p>
@@ -180,7 +169,7 @@
         <w:jc w:val="left"/>
       </w:pPr>
       <w:r>
-        <w:t>SSF-00 · 00:00–00:22</w:t>
+        <w:t>SSF-00 · 00:00–00:20</w:t>
       </w:r>
       <w:r>
         <w:br/>
@@ -210,7 +199,7 @@
                     <pic:cNvPicPr/>
                   </pic:nvPicPr>
                   <pic:blipFill>
-                    <a:blip r:embed="rId12"/>
+                    <a:blip r:embed="rId13"/>
                     <a:stretch>
                       <a:fillRect/>
                     </a:stretch>
@@ -237,7 +226,7 @@
         <w:t xml:space="preserve">Narration. </w:t>
       </w:r>
       <w:r>
-        <w:t>This blue folder just arrived from Social Software at UCLA. Inside is Scores for Social Software, a spring 2026 edition of 64 hand-produced artist scores. The copy in my hands is number fifty-one, assembled after ten weeks of making, testing, and performing together.</w:t>
+        <w:t>This blue folder just arrived from Social Software at UCLA. Inside is Scores for Social Software, a spring 2026 edition of 64 hand-produced artist scores. This is copy #51, assembled after ten weeks of making, testing, and performing together.</w:t>
       </w:r>
     </w:p>
     <w:p>
@@ -261,7 +250,7 @@
         <w:jc w:val="left"/>
       </w:pPr>
       <w:r>
-        <w:t>SSF-01 · 00:22–00:34</w:t>
+        <w:t>SSF-01 · 00:20–00:34</w:t>
       </w:r>
       <w:r>
         <w:br/>
@@ -291,7 +280,7 @@
                     <pic:cNvPicPr/>
                   </pic:nvPicPr>
                   <pic:blipFill>
-                    <a:blip r:embed="rId13"/>
+                    <a:blip r:embed="rId14"/>
                     <a:stretch>
                       <a:fillRect/>
                     </a:stretch>
@@ -372,7 +361,7 @@
                     <pic:cNvPicPr/>
                   </pic:nvPicPr>
                   <pic:blipFill>
-                    <a:blip r:embed="rId14"/>
+                    <a:blip r:embed="rId15"/>
                     <a:stretch>
                       <a:fillRect/>
                     </a:stretch>
@@ -423,7 +412,7 @@
         <w:jc w:val="left"/>
       </w:pPr>
       <w:r>
-        <w:t>SSF-03 · 00:42–00:53</w:t>
+        <w:t>SSF-03 · 00:42–00:54</w:t>
       </w:r>
       <w:r>
         <w:br/>
@@ -453,7 +442,7 @@
                     <pic:cNvPicPr/>
                   </pic:nvPicPr>
                   <pic:blipFill>
-                    <a:blip r:embed="rId15"/>
+                    <a:blip r:embed="rId16"/>
                     <a:stretch>
                       <a:fillRect/>
                     </a:stretch>
@@ -504,7 +493,7 @@
         <w:jc w:val="left"/>
       </w:pPr>
       <w:r>
-        <w:t>SSF-04 · 00:53–01:10</w:t>
+        <w:t>SSF-04 · 00:54–01:09</w:t>
       </w:r>
       <w:r>
         <w:br/>
@@ -534,7 +523,7 @@
                     <pic:cNvPicPr/>
                   </pic:nvPicPr>
                   <pic:blipFill>
-                    <a:blip r:embed="rId16"/>
+                    <a:blip r:embed="rId17"/>
                     <a:stretch>
                       <a:fillRect/>
                     </a:stretch>
@@ -585,7 +574,7 @@
         <w:jc w:val="left"/>
       </w:pPr>
       <w:r>
-        <w:t>SSF-05 · 01:10–01:21</w:t>
+        <w:t>SSF-05 · 01:09–01:20</w:t>
       </w:r>
       <w:r>
         <w:br/>
@@ -615,7 +604,7 @@
                     <pic:cNvPicPr/>
                   </pic:nvPicPr>
                   <pic:blipFill>
-                    <a:blip r:embed="rId17"/>
+                    <a:blip r:embed="rId18"/>
                     <a:stretch>
                       <a:fillRect/>
                     </a:stretch>
@@ -666,7 +655,7 @@
         <w:jc w:val="left"/>
       </w:pPr>
       <w:r>
-        <w:t>SSF-06 · 01:21–01:32</w:t>
+        <w:t>SSF-06 · 01:20–01:32</w:t>
       </w:r>
       <w:r>
         <w:br/>
@@ -696,7 +685,7 @@
                     <pic:cNvPicPr/>
                   </pic:nvPicPr>
                   <pic:blipFill>
-                    <a:blip r:embed="rId18"/>
+                    <a:blip r:embed="rId19"/>
                     <a:stretch>
                       <a:fillRect/>
                     </a:stretch>
@@ -747,7 +736,7 @@
         <w:jc w:val="left"/>
       </w:pPr>
       <w:r>
-        <w:t>SSF-07 · 01:32–01:46</w:t>
+        <w:t>SSF-07 · 01:32–01:45</w:t>
       </w:r>
       <w:r>
         <w:br/>
@@ -777,7 +766,7 @@
                     <pic:cNvPicPr/>
                   </pic:nvPicPr>
                   <pic:blipFill>
-                    <a:blip r:embed="rId19"/>
+                    <a:blip r:embed="rId20"/>
                     <a:stretch>
                       <a:fillRect/>
                     </a:stretch>
@@ -828,7 +817,7 @@
         <w:jc w:val="left"/>
       </w:pPr>
       <w:r>
-        <w:t>SSF-08 · 01:46–01:58</w:t>
+        <w:t>SSF-08 · 01:45–01:56</w:t>
       </w:r>
       <w:r>
         <w:br/>
@@ -858,7 +847,7 @@
                     <pic:cNvPicPr/>
                   </pic:nvPicPr>
                   <pic:blipFill>
-                    <a:blip r:embed="rId20"/>
+                    <a:blip r:embed="rId21"/>
                     <a:stretch>
                       <a:fillRect/>
                     </a:stretch>
@@ -909,7 +898,7 @@
         <w:jc w:val="left"/>
       </w:pPr>
       <w:r>
-        <w:t>SSF-09 · 01:58–02:09</w:t>
+        <w:t>SSF-09 · 01:56–02:08</w:t>
       </w:r>
       <w:r>
         <w:br/>
@@ -939,7 +928,7 @@
                     <pic:cNvPicPr/>
                   </pic:nvPicPr>
                   <pic:blipFill>
-                    <a:blip r:embed="rId21"/>
+                    <a:blip r:embed="rId22"/>
                     <a:stretch>
                       <a:fillRect/>
                     </a:stretch>
@@ -990,7 +979,7 @@
         <w:jc w:val="left"/>
       </w:pPr>
       <w:r>
-        <w:t>SSF-10 · 02:09–02:19</w:t>
+        <w:t>SSF-10 · 02:08–02:19</w:t>
       </w:r>
       <w:r>
         <w:br/>
@@ -1020,7 +1009,7 @@
                     <pic:cNvPicPr/>
                   </pic:nvPicPr>
                   <pic:blipFill>
-                    <a:blip r:embed="rId22"/>
+                    <a:blip r:embed="rId23"/>
                     <a:stretch>
                       <a:fillRect/>
                     </a:stretch>
@@ -1071,7 +1060,7 @@
         <w:jc w:val="left"/>
       </w:pPr>
       <w:r>
-        <w:t>SSF-11 · 02:19–02:55</w:t>
+        <w:t>SSF-11 · 02:19–02:53</w:t>
       </w:r>
       <w:r>
         <w:br/>
@@ -1101,7 +1090,7 @@
                     <pic:cNvPicPr/>
                   </pic:nvPicPr>
                   <pic:blipFill>
-                    <a:blip r:embed="rId23"/>
+                    <a:blip r:embed="rId24"/>
                     <a:stretch>
                       <a:fillRect/>
                     </a:stretch>

</xml_diff>

<commit_message>
reel: preserve edition evidence in review cut
</commit_message>
<xml_diff>
--- a/marketing/sosoft-reel/receipt/revision-03/scores-for-social-software-r03-receipt.docx
+++ b/marketing/sosoft-reel/receipt/revision-03/scores-for-social-software-r03-receipt.docx
@@ -24,7 +24,7 @@
         <w:rPr>
           <w:color w:val="5A5A5A"/>
         </w:rPr>
-        <w:t>Review cut · 02:53 · 1080 × 1920 vertical · prepared 27 July 2026</w:t>
+        <w:t>Review cut · 02:53 · 1080 × 1920 vertical · prepared 28 July 2026</w:t>
       </w:r>
     </w:p>
     <w:p>
@@ -119,7 +119,7 @@
         <w:t xml:space="preserve">Content. </w:t>
       </w:r>
       <w:r>
-        <w:t>Added ‘64 hand-produced artist scores,’ ‘copy #51,’ the two-edition invitation, Jeffrey’s goodbye, and Casey’s June 13 Fuser photographs; widened Jordan Silver and kept Banyi Huang’s complete credit in one utterance.</w:t>
+        <w:t>Added ‘64 hand-produced artist scores,’ ‘copy #51,’ the two-edition invitation, Jeffrey’s goodbye, and Casey’s Fuser photographs; showed Chelly Jin’s and Thomas Noya’s physical editions, raised Em Lugo’s cards, widened Jordan Silver’s sheet evidence, and kept Banyi Huang’s complete credit in one utterance.</w:t>
       </w:r>
     </w:p>
     <w:p>

</xml_diff>